<commit_message>
feat: Complete RPA backend implementation
- 🤖 Add harvesters management with live API status
- 📡 Add data sources with URL lists management
- 🕐 Add harvest scheduling with automatic synchronization
- 🔄 Add workflow templates system
- 📊 Enhanced products API with seller/price counts
- �� Add ZIP export for analysis results
- 🔐 Complete JWT authentication system
- 📚 Add comprehensive API documentation
- 🗄️ Add database migration guide
- 🛠️ Add SQL schema files

New API endpoints:
- /api/v1/harvesters - CRUD + live status + API forwarding
- /api/v1/data-sources - URL lists management
- /api/v1/harvest-schedule - Scheduling with auto-sync
- /api/v1/workflows - Template system
- /api/v1/results/:id/download - ZIP export

Features:
- Automatic harvester API synchronization
- Real-time status from harvester services
- Foreign key constraints and data integrity
- Support for Python and Node.js analysis scripts
- Comprehensive error handling and validation
</commit_message>
<xml_diff>
--- a/scripts/reports/template.docx
+++ b/scripts/reports/template.docx
@@ -9,6 +9,7 @@
           <w:ilvl w:val="0"/>
           <w:numId w:val="0"/>
         </w:numPr>
+        <w:ind w:hanging="0" w:left="0"/>
         <w:outlineLvl w:val="0"/>
         <w:rPr>
           <w:b/>
@@ -30,6 +31,7 @@
           <w:numId w:val="0"/>
         </w:numPr>
         <w:spacing w:before="120" w:after="0"/>
+        <w:ind w:hanging="0" w:left="0"/>
         <w:outlineLvl w:val="0"/>
         <w:rPr>
           <w:rFonts w:ascii="3 of 9 Barcode" w:hAnsi="3 of 9 Barcode"/>
@@ -101,6 +103,7 @@
           <w:ilvl w:val="0"/>
           <w:numId w:val="0"/>
         </w:numPr>
+        <w:ind w:hanging="0" w:left="0"/>
         <w:outlineLvl w:val="0"/>
         <w:rPr/>
       </w:pPr>
@@ -132,6 +135,7 @@
           <w:ilvl w:val="0"/>
           <w:numId w:val="0"/>
         </w:numPr>
+        <w:ind w:hanging="0" w:left="0"/>
         <w:outlineLvl w:val="0"/>
         <w:rPr/>
       </w:pPr>
@@ -155,9 +159,9 @@
         <w:tblLook w:val="01e0" w:noHBand="0" w:noVBand="0" w:firstColumn="1" w:lastRow="1" w:lastColumn="1" w:firstRow="1"/>
       </w:tblPr>
       <w:tblGrid>
-        <w:gridCol w:w="5302"/>
+        <w:gridCol w:w="5301"/>
         <w:gridCol w:w="2290"/>
-        <w:gridCol w:w="2046"/>
+        <w:gridCol w:w="2047"/>
       </w:tblGrid>
       <w:tr>
         <w:trPr>
@@ -165,7 +169,7 @@
         </w:trPr>
         <w:tc>
           <w:tcPr>
-            <w:tcW w:w="5302" w:type="dxa"/>
+            <w:tcW w:w="5301" w:type="dxa"/>
             <w:tcBorders/>
           </w:tcPr>
           <w:p>
@@ -234,7 +238,7 @@
         </w:tc>
         <w:tc>
           <w:tcPr>
-            <w:tcW w:w="2046" w:type="dxa"/>
+            <w:tcW w:w="2047" w:type="dxa"/>
             <w:tcBorders/>
           </w:tcPr>
           <w:p>
@@ -252,7 +256,7 @@
         <w:trPr/>
         <w:tc>
           <w:tcPr>
-            <w:tcW w:w="5302" w:type="dxa"/>
+            <w:tcW w:w="5301" w:type="dxa"/>
             <w:tcBorders/>
           </w:tcPr>
           <w:p>
@@ -331,7 +335,7 @@
         </w:tc>
         <w:tc>
           <w:tcPr>
-            <w:tcW w:w="2046" w:type="dxa"/>
+            <w:tcW w:w="2047" w:type="dxa"/>
             <w:tcBorders/>
           </w:tcPr>
           <w:p>
@@ -703,8 +707,8 @@
         <w:pStyle w:val="Normal"/>
         <w:rPr/>
       </w:pPr>
-      <w:bookmarkStart w:id="1" w:name="Text10"/>
-      <w:bookmarkStart w:id="2" w:name="Text12"/>
+      <w:bookmarkStart w:id="1" w:name="Text12"/>
+      <w:bookmarkStart w:id="2" w:name="Text10"/>
       <w:r>
         <w:rPr/>
         <w:t xml:space="preserve">Jméno Příjmení </w:t>
@@ -799,22 +803,30 @@
       </w:r>
       <w:r>
         <w:rPr>
-          <w:highlight w:val="yellow"/>
-        </w:rPr>
-        <w:t>XXX</w:t>
-      </w:r>
-      <w:r>
-        <w:rPr/>
+          <w:b/>
+          <w:bCs/>
+          <w:shd w:fill="auto" w:val="clear"/>
+        </w:rPr>
+        <w:t>[[dateFromDMY]]</w:t>
+      </w:r>
+      <w:r>
+        <w:rPr>
+          <w:shd w:fill="auto" w:val="clear"/>
+        </w:rPr>
         <w:t xml:space="preserve"> do </w:t>
       </w:r>
       <w:r>
         <w:rPr>
-          <w:highlight w:val="yellow"/>
-        </w:rPr>
-        <w:t>XXX</w:t>
-      </w:r>
-      <w:r>
-        <w:rPr/>
+          <w:b/>
+          <w:bCs/>
+          <w:shd w:fill="auto" w:val="clear"/>
+        </w:rPr>
+        <w:t>[[dateToDMY]]</w:t>
+      </w:r>
+      <w:r>
+        <w:rPr>
+          <w:shd w:fill="auto" w:val="clear"/>
+        </w:rPr>
         <w:t>.</w:t>
       </w:r>
     </w:p>
@@ -843,13 +855,7 @@
           <w:textDirection w:val="lrTb"/>
           <w:docGrid w:type="default" w:linePitch="100" w:charSpace="0"/>
         </w:sectPr>
-        <w:pStyle w:val="Normal"/>
-        <w:jc w:val="left"/>
-        <w:rPr/>
-      </w:pPr>
-      <w:r>
-        <w:rPr/>
-      </w:r>
+      </w:pPr>
       <w:r>
         <w:br w:type="page"/>
       </w:r>
@@ -902,9 +908,9 @@
           <w:bCs/>
           <w:sz w:val="32"/>
           <w:szCs w:val="32"/>
-          <w:highlight w:val="yellow"/>
-        </w:rPr>
-        <w:t>XXX</w:t>
+          <w:shd w:fill="auto" w:val="clear"/>
+        </w:rPr>
+        <w:t>[[dateFromDMY]] do [[dateToDMY]]</w:t>
       </w:r>
       <w:r>
         <w:rPr>
@@ -913,17 +919,7 @@
           <w:sz w:val="32"/>
           <w:szCs w:val="32"/>
         </w:rPr>
-        <w:t xml:space="preserve"> do </w:t>
-      </w:r>
-      <w:r>
-        <w:rPr>
-          <w:b/>
-          <w:bCs/>
-          <w:sz w:val="32"/>
-          <w:szCs w:val="32"/>
-          <w:highlight w:val="yellow"/>
-        </w:rPr>
-        <w:t>XXX</w:t>
+        <w:t xml:space="preserve"> </w:t>
       </w:r>
     </w:p>
     <w:p>
@@ -985,14 +981,9 @@
           <w:hyperlink w:anchor="__RefHeading___Toc34013_4053928590">
             <w:r>
               <w:rPr>
-                <w:rStyle w:val="IndexLink"/>
+                <w:rStyle w:val="ListLabel64"/>
               </w:rPr>
               <w:t>[[index]]. [[name]]</w:t>
-            </w:r>
-            <w:r>
-              <w:rPr>
-                <w:rStyle w:val="IndexLink"/>
-              </w:rPr>
               <w:tab/>
               <w:t>2</w:t>
             </w:r>
@@ -1657,7 +1648,7 @@
       <w:pgNumType w:fmt="decimal"/>
       <w:formProt w:val="false"/>
       <w:textDirection w:val="lrTb"/>
-      <w:docGrid w:type="default" w:linePitch="312" w:charSpace="4294961151"/>
+      <w:docGrid w:type="default" w:linePitch="312" w:charSpace="0"/>
     </w:sectPr>
   </w:body>
 </w:document>
@@ -1824,7 +1815,7 @@
       <w:rPr>
         <w:rStyle w:val="PageNumber"/>
       </w:rPr>
-      <w:t>4</w:t>
+      <w:t>6</w:t>
     </w:r>
     <w:r>
       <w:rPr>
@@ -3305,6 +3296,7 @@
     <w:rsid w:val="001e7b23"/>
     <w:pPr>
       <w:widowControl/>
+      <w:suppressAutoHyphens w:val="true"/>
       <w:bidi w:val="0"/>
       <w:spacing w:before="0" w:after="0"/>
       <w:jc w:val="both"/>
@@ -3512,7 +3504,6 @@
   </w:style>
   <w:style w:type="character" w:styleId="FootnoteCharacters">
     <w:name w:val="Footnote Characters"/>
-    <w:basedOn w:val="DefaultParagraphFont"/>
     <w:uiPriority w:val="99"/>
     <w:semiHidden/>
     <w:qFormat/>
@@ -3800,6 +3791,7 @@
     <w:rsid w:val="00a0608b"/>
     <w:pPr>
       <w:widowControl/>
+      <w:suppressAutoHyphens w:val="true"/>
       <w:bidi w:val="0"/>
       <w:spacing w:before="0" w:after="0"/>
       <w:jc w:val="left"/>

</xml_diff>